<commit_message>
finish everything with application
</commit_message>
<xml_diff>
--- a/Supplemental Information/Test Cases - Blank.docx
+++ b/Supplemental Information/Test Cases - Blank.docx
@@ -337,6 +337,178 @@
       <w:r>
         <w:t>Not digit input</w:t>
       </w:r>
+    </w:p>
+    <w:p>
+      <w:pPr>
+        <w:pStyle w:val="ListParagraph"/>
+        <w:numPr>
+          <w:ilvl w:val="0"/>
+          <w:numId w:val="1"/>
+        </w:numPr>
+      </w:pPr>
+      <w:r>
+        <w:t>Pay calculations</w:t>
+      </w:r>
+    </w:p>
+    <w:p>
+      <w:pPr>
+        <w:pStyle w:val="ListParagraph"/>
+        <w:numPr>
+          <w:ilvl w:val="1"/>
+          <w:numId w:val="1"/>
+        </w:numPr>
+      </w:pPr>
+      <w:r>
+        <w:t>I need to test if all the pay and deduction calculations are accurate</w:t>
+      </w:r>
+    </w:p>
+    <w:p>
+      <w:pPr>
+        <w:pStyle w:val="ListParagraph"/>
+        <w:numPr>
+          <w:ilvl w:val="1"/>
+          <w:numId w:val="1"/>
+        </w:numPr>
+      </w:pPr>
+      <w:r>
+        <w:t>Gross pay</w:t>
+      </w:r>
+    </w:p>
+    <w:p>
+      <w:pPr>
+        <w:pStyle w:val="ListParagraph"/>
+        <w:numPr>
+          <w:ilvl w:val="1"/>
+          <w:numId w:val="1"/>
+        </w:numPr>
+      </w:pPr>
+      <w:r>
+        <w:t>State tax</w:t>
+      </w:r>
+    </w:p>
+    <w:p>
+      <w:pPr>
+        <w:pStyle w:val="ListParagraph"/>
+        <w:numPr>
+          <w:ilvl w:val="1"/>
+          <w:numId w:val="1"/>
+        </w:numPr>
+      </w:pPr>
+      <w:r>
+        <w:t>Federal tax employee</w:t>
+      </w:r>
+    </w:p>
+    <w:p>
+      <w:pPr>
+        <w:pStyle w:val="ListParagraph"/>
+        <w:numPr>
+          <w:ilvl w:val="1"/>
+          <w:numId w:val="1"/>
+        </w:numPr>
+      </w:pPr>
+      <w:r>
+        <w:t>Federal tax employer</w:t>
+      </w:r>
+    </w:p>
+    <w:p>
+      <w:pPr>
+        <w:pStyle w:val="ListParagraph"/>
+        <w:numPr>
+          <w:ilvl w:val="1"/>
+          <w:numId w:val="1"/>
+        </w:numPr>
+      </w:pPr>
+      <w:r>
+        <w:t>social security tax employee</w:t>
+      </w:r>
+    </w:p>
+    <w:p>
+      <w:pPr>
+        <w:pStyle w:val="ListParagraph"/>
+        <w:numPr>
+          <w:ilvl w:val="1"/>
+          <w:numId w:val="1"/>
+        </w:numPr>
+      </w:pPr>
+      <w:r>
+        <w:t>social security tax employer</w:t>
+      </w:r>
+    </w:p>
+    <w:p>
+      <w:pPr>
+        <w:pStyle w:val="ListParagraph"/>
+        <w:numPr>
+          <w:ilvl w:val="1"/>
+          <w:numId w:val="1"/>
+        </w:numPr>
+      </w:pPr>
+      <w:proofErr w:type="spellStart"/>
+      <w:r>
+        <w:t>medicare</w:t>
+      </w:r>
+      <w:proofErr w:type="spellEnd"/>
+      <w:r>
+        <w:t xml:space="preserve"> employee</w:t>
+      </w:r>
+    </w:p>
+    <w:p>
+      <w:pPr>
+        <w:pStyle w:val="ListParagraph"/>
+        <w:numPr>
+          <w:ilvl w:val="1"/>
+          <w:numId w:val="1"/>
+        </w:numPr>
+      </w:pPr>
+      <w:proofErr w:type="spellStart"/>
+      <w:r>
+        <w:t>medicare</w:t>
+      </w:r>
+      <w:proofErr w:type="spellEnd"/>
+      <w:r>
+        <w:t xml:space="preserve"> employer</w:t>
+      </w:r>
+    </w:p>
+    <w:p>
+      <w:pPr>
+        <w:pStyle w:val="ListParagraph"/>
+        <w:numPr>
+          <w:ilvl w:val="1"/>
+          <w:numId w:val="1"/>
+        </w:numPr>
+      </w:pPr>
+      <w:r>
+        <w:t>Medical</w:t>
+      </w:r>
+    </w:p>
+    <w:p>
+      <w:pPr>
+        <w:pStyle w:val="ListParagraph"/>
+        <w:numPr>
+          <w:ilvl w:val="1"/>
+          <w:numId w:val="1"/>
+        </w:numPr>
+      </w:pPr>
+      <w:r>
+        <w:lastRenderedPageBreak/>
+        <w:t>Stipend</w:t>
+      </w:r>
+    </w:p>
+    <w:p>
+      <w:pPr>
+        <w:pStyle w:val="ListParagraph"/>
+        <w:numPr>
+          <w:ilvl w:val="1"/>
+          <w:numId w:val="1"/>
+        </w:numPr>
+      </w:pPr>
+      <w:r>
+        <w:t>Net pay</w:t>
+      </w:r>
+    </w:p>
+    <w:p>
+      <w:pPr>
+        <w:ind w:left="1080"/>
+      </w:pPr>
     </w:p>
     <w:sectPr>
       <w:headerReference w:type="default" r:id="rId7"/>

</xml_diff>